<commit_message>
Update 222-booth directory from official PDF: fix booth offset, sync Form 20 data, and add dual booth numbers and village identification
</commit_message>
<xml_diff>
--- a/public/Raja_Sansi_Detailed_222_Boothwise_Masterplan.docx
+++ b/public/Raja_Sansi_Detailed_222_Boothwise_Masterplan.docx
@@ -275,7 +275,7 @@
               <w:rPr>
                 <w:sz w:val="16"/>
               </w:rPr>
-              <w:t>Gulgarh + Niamatabad</w:t>
+              <w:t>Gulgarh</w:t>
             </w:r>
           </w:p>
         </w:tc>
@@ -429,7 +429,7 @@
               <w:rPr>
                 <w:sz w:val="16"/>
               </w:rPr>
-              <w:t>Awan Basau + Dial</w:t>
+              <w:t>Awan Basau</w:t>
             </w:r>
           </w:p>
         </w:tc>
@@ -583,7 +583,7 @@
               <w:rPr>
                 <w:sz w:val="16"/>
               </w:rPr>
-              <w:t>Awan Basau</w:t>
+              <w:t>Awan Bassau</w:t>
             </w:r>
           </w:p>
         </w:tc>
@@ -1045,7 +1045,7 @@
               <w:rPr>
                 <w:sz w:val="16"/>
               </w:rPr>
-              <w:t>Burj + Chindi Nain</w:t>
+              <w:t>Burj</w:t>
             </w:r>
           </w:p>
         </w:tc>
@@ -1661,7 +1661,7 @@
               <w:rPr>
                 <w:sz w:val="16"/>
               </w:rPr>
-              <w:t>Jhunj</w:t>
+              <w:t>Bhindi Aulakh Khurd</w:t>
             </w:r>
           </w:p>
         </w:tc>
@@ -1815,7 +1815,7 @@
               <w:rPr>
                 <w:sz w:val="16"/>
               </w:rPr>
-              <w:t>Bhindi Aulakh Khurd</w:t>
+              <w:t>Jasarour</w:t>
             </w:r>
           </w:p>
         </w:tc>
@@ -1969,7 +1969,7 @@
               <w:rPr>
                 <w:sz w:val="16"/>
               </w:rPr>
-              <w:t>Bhindi Aulakh Khurd</w:t>
+              <w:t>Jasarour</w:t>
             </w:r>
           </w:p>
         </w:tc>
@@ -2123,7 +2123,7 @@
               <w:rPr>
                 <w:sz w:val="16"/>
               </w:rPr>
-              <w:t>Jasraur</w:t>
+              <w:t>Kotla Suraaj Lohar</w:t>
             </w:r>
           </w:p>
         </w:tc>
@@ -2277,7 +2277,7 @@
               <w:rPr>
                 <w:sz w:val="16"/>
               </w:rPr>
-              <w:t>Jasraur</w:t>
+              <w:t>Motala</w:t>
             </w:r>
           </w:p>
         </w:tc>
@@ -2431,7 +2431,7 @@
               <w:rPr>
                 <w:sz w:val="16"/>
               </w:rPr>
-              <w:t>Kotla Suraj Lohar + Jai Ram Kot</w:t>
+              <w:t>Kotli Khera</w:t>
             </w:r>
           </w:p>
         </w:tc>
@@ -2585,7 +2585,7 @@
               <w:rPr>
                 <w:sz w:val="16"/>
               </w:rPr>
-              <w:t>Metla</w:t>
+              <w:t>Panju Kalal</w:t>
             </w:r>
           </w:p>
         </w:tc>
@@ -2739,7 +2739,7 @@
               <w:rPr>
                 <w:sz w:val="16"/>
               </w:rPr>
-              <w:t>Kotli Khaira + Vandal + Bhalot</w:t>
+              <w:t>Shahpur</w:t>
             </w:r>
           </w:p>
         </w:tc>
@@ -2893,7 +2893,7 @@
               <w:rPr>
                 <w:sz w:val="16"/>
               </w:rPr>
-              <w:t>Panj Kala + Chak Bajid</w:t>
+              <w:t>Bhindi Saidan</w:t>
             </w:r>
           </w:p>
         </w:tc>
@@ -3047,7 +3047,7 @@
               <w:rPr>
                 <w:sz w:val="16"/>
               </w:rPr>
-              <w:t>Shahpur + Miadi Khurd + Alampur + Chak Fateh Khan</w:t>
+              <w:t>Bhindi Saidan</w:t>
             </w:r>
           </w:p>
         </w:tc>
@@ -4125,7 +4125,7 @@
               <w:rPr>
                 <w:sz w:val="16"/>
               </w:rPr>
-              <w:t>Bhindi Saidan</w:t>
+              <w:t>Kuttiwal</w:t>
             </w:r>
           </w:p>
         </w:tc>
@@ -4279,7 +4279,7 @@
               <w:rPr>
                 <w:sz w:val="16"/>
               </w:rPr>
-              <w:t>Bhindi Saidan</w:t>
+              <w:t>Kotli Dosandhi</w:t>
             </w:r>
           </w:p>
         </w:tc>
@@ -4433,7 +4433,7 @@
               <w:rPr>
                 <w:sz w:val="16"/>
               </w:rPr>
-              <w:t>Kuttiwal</w:t>
+              <w:t>Kotli Dosandhi</w:t>
             </w:r>
           </w:p>
         </w:tc>
@@ -4587,7 +4587,7 @@
               <w:rPr>
                 <w:sz w:val="16"/>
               </w:rPr>
-              <w:t>Kotli Dosandhi</w:t>
+              <w:t>Bhagupur Bet</w:t>
             </w:r>
           </w:p>
         </w:tc>
@@ -4741,7 +4741,7 @@
               <w:rPr>
                 <w:sz w:val="16"/>
               </w:rPr>
-              <w:t>Kotli Desan</w:t>
+              <w:t>Vehra</w:t>
             </w:r>
           </w:p>
         </w:tc>
@@ -4895,7 +4895,7 @@
               <w:rPr>
                 <w:sz w:val="16"/>
               </w:rPr>
-              <w:t>Bhaggupur Bet</w:t>
+              <w:t>Dugg</w:t>
             </w:r>
           </w:p>
         </w:tc>
@@ -5049,7 +5049,7 @@
               <w:rPr>
                 <w:sz w:val="16"/>
               </w:rPr>
-              <w:t>Vehra + Vehra Abadi Wala Nurewal</w:t>
+              <w:t>Dugg Dogar</w:t>
             </w:r>
           </w:p>
         </w:tc>
@@ -5203,7 +5203,7 @@
               <w:rPr>
                 <w:sz w:val="16"/>
               </w:rPr>
-              <w:t>Dagg</w:t>
+              <w:t>Saidpur Kalan</w:t>
             </w:r>
           </w:p>
         </w:tc>
@@ -5357,7 +5357,7 @@
               <w:rPr>
                 <w:sz w:val="16"/>
               </w:rPr>
-              <w:t>Dagg Dogar</w:t>
+              <w:t>Toot</w:t>
             </w:r>
           </w:p>
         </w:tc>
@@ -5511,7 +5511,7 @@
               <w:rPr>
                 <w:sz w:val="16"/>
               </w:rPr>
-              <w:t>Saidpur Kalan</w:t>
+              <w:t>Chhan Kalan</w:t>
             </w:r>
           </w:p>
         </w:tc>
@@ -5665,7 +5665,7 @@
               <w:rPr>
                 <w:sz w:val="16"/>
               </w:rPr>
-              <w:t>Tut</w:t>
+              <w:t>Mohaleke</w:t>
             </w:r>
           </w:p>
         </w:tc>
@@ -5819,7 +5819,7 @@
               <w:rPr>
                 <w:sz w:val="16"/>
               </w:rPr>
-              <w:t>Chhann Kalan</w:t>
+              <w:t>Mandiawala</w:t>
             </w:r>
           </w:p>
         </w:tc>
@@ -5973,7 +5973,7 @@
               <w:rPr>
                 <w:sz w:val="16"/>
               </w:rPr>
-              <w:t>Mehleke</w:t>
+              <w:t>Lodhi Gujjar</w:t>
             </w:r>
           </w:p>
         </w:tc>
@@ -6127,7 +6127,7 @@
               <w:rPr>
                 <w:sz w:val="16"/>
               </w:rPr>
-              <w:t>Mandiawala</w:t>
+              <w:t>Manj</w:t>
             </w:r>
           </w:p>
         </w:tc>
@@ -6281,7 +6281,7 @@
               <w:rPr>
                 <w:sz w:val="16"/>
               </w:rPr>
-              <w:t>Lepi Gujjar</w:t>
+              <w:t>Kakkar</w:t>
             </w:r>
           </w:p>
         </w:tc>
@@ -6435,7 +6435,7 @@
               <w:rPr>
                 <w:sz w:val="16"/>
               </w:rPr>
-              <w:t>Nawa Jeevan + Nathupura</w:t>
+              <w:t>Kakkar</w:t>
             </w:r>
           </w:p>
         </w:tc>
@@ -6589,7 +6589,7 @@
               <w:rPr>
                 <w:sz w:val="16"/>
               </w:rPr>
-              <w:t>Manj</w:t>
+              <w:t>Kakkar</w:t>
             </w:r>
           </w:p>
         </w:tc>
@@ -6743,7 +6743,7 @@
               <w:rPr>
                 <w:sz w:val="16"/>
               </w:rPr>
-              <w:t>Manj + Dasmesh Nagar</w:t>
+              <w:t>Kakkar</w:t>
             </w:r>
           </w:p>
         </w:tc>
@@ -6897,7 +6897,7 @@
               <w:rPr>
                 <w:sz w:val="16"/>
               </w:rPr>
-              <w:t>Kakkar</w:t>
+              <w:t>Ranian</w:t>
             </w:r>
           </w:p>
         </w:tc>
@@ -7051,7 +7051,7 @@
               <w:rPr>
                 <w:sz w:val="16"/>
               </w:rPr>
-              <w:t>Kakkar</w:t>
+              <w:t>Chakk Alla Bakhsh</w:t>
             </w:r>
           </w:p>
         </w:tc>
@@ -7205,7 +7205,7 @@
               <w:rPr>
                 <w:sz w:val="16"/>
               </w:rPr>
-              <w:t>Kakkar</w:t>
+              <w:t>Dhariwal</w:t>
             </w:r>
           </w:p>
         </w:tc>
@@ -7359,7 +7359,7 @@
               <w:rPr>
                 <w:sz w:val="16"/>
               </w:rPr>
-              <w:t>Kakkar</w:t>
+              <w:t>Pandori</w:t>
             </w:r>
           </w:p>
         </w:tc>
@@ -7513,7 +7513,7 @@
               <w:rPr>
                 <w:sz w:val="16"/>
               </w:rPr>
-              <w:t>Rania</w:t>
+              <w:t>Rai</w:t>
             </w:r>
           </w:p>
         </w:tc>
@@ -7667,7 +7667,7 @@
               <w:rPr>
                 <w:sz w:val="16"/>
               </w:rPr>
-              <w:t>Chak Alla Baksh</w:t>
+              <w:t>Gagarmal</w:t>
             </w:r>
           </w:p>
         </w:tc>
@@ -7821,7 +7821,7 @@
               <w:rPr>
                 <w:sz w:val="16"/>
               </w:rPr>
-              <w:t>Dhariwal + Udhar + Mulla Kot</w:t>
+              <w:t>Sarangra</w:t>
             </w:r>
           </w:p>
         </w:tc>
@@ -7975,7 +7975,7 @@
               <w:rPr>
                 <w:sz w:val="16"/>
               </w:rPr>
-              <w:t>Panderi + Madhpura</w:t>
+              <w:t>Sarangra</w:t>
             </w:r>
           </w:p>
         </w:tc>
@@ -8129,7 +8129,7 @@
               <w:rPr>
                 <w:sz w:val="16"/>
               </w:rPr>
-              <w:t>Rai</w:t>
+              <w:t>Sarangra</w:t>
             </w:r>
           </w:p>
         </w:tc>
@@ -8283,7 +8283,7 @@
               <w:rPr>
                 <w:sz w:val="16"/>
               </w:rPr>
-              <w:t>Gagramal</w:t>
+              <w:t>Lelian</w:t>
             </w:r>
           </w:p>
         </w:tc>
@@ -8437,7 +8437,7 @@
               <w:rPr>
                 <w:sz w:val="16"/>
               </w:rPr>
-              <w:t>Sarangra</w:t>
+              <w:t>Panju Rai</w:t>
             </w:r>
           </w:p>
         </w:tc>
@@ -8591,7 +8591,7 @@
               <w:rPr>
                 <w:sz w:val="16"/>
               </w:rPr>
-              <w:t>Sarangra</w:t>
+              <w:t>Hetampura</w:t>
             </w:r>
           </w:p>
         </w:tc>
@@ -8745,7 +8745,7 @@
               <w:rPr>
                 <w:sz w:val="16"/>
               </w:rPr>
-              <w:t>Sarangra</w:t>
+              <w:t>Kanve</w:t>
             </w:r>
           </w:p>
         </w:tc>
@@ -8899,7 +8899,7 @@
               <w:rPr>
                 <w:sz w:val="16"/>
               </w:rPr>
-              <w:t>Lelian</w:t>
+              <w:t>Lopoke</w:t>
             </w:r>
           </w:p>
         </w:tc>
@@ -9053,7 +9053,7 @@
               <w:rPr>
                 <w:sz w:val="16"/>
               </w:rPr>
-              <w:t>Panj Rai</w:t>
+              <w:t>Lopoke</w:t>
             </w:r>
           </w:p>
         </w:tc>
@@ -9207,7 +9207,7 @@
               <w:rPr>
                 <w:sz w:val="16"/>
               </w:rPr>
-              <w:t>Hetampura</w:t>
+              <w:t>Lopoke</w:t>
             </w:r>
           </w:p>
         </w:tc>
@@ -9361,7 +9361,7 @@
               <w:rPr>
                 <w:sz w:val="16"/>
               </w:rPr>
-              <w:t>Kande</w:t>
+              <w:t>Lopoke</w:t>
             </w:r>
           </w:p>
         </w:tc>
@@ -9515,7 +9515,7 @@
               <w:rPr>
                 <w:sz w:val="16"/>
               </w:rPr>
-              <w:t>Lepoke</w:t>
+              <w:t>Lopoke</w:t>
             </w:r>
           </w:p>
         </w:tc>
@@ -9669,7 +9669,7 @@
               <w:rPr>
                 <w:sz w:val="16"/>
               </w:rPr>
-              <w:t>Lepoke</w:t>
+              <w:t>Preet Nagar</w:t>
             </w:r>
           </w:p>
         </w:tc>
@@ -9823,7 +9823,7 @@
               <w:rPr>
                 <w:sz w:val="16"/>
               </w:rPr>
-              <w:t>Lepoke</w:t>
+              <w:t>Veroke</w:t>
             </w:r>
           </w:p>
         </w:tc>
@@ -9977,7 +9977,7 @@
               <w:rPr>
                 <w:sz w:val="16"/>
               </w:rPr>
-              <w:t>Lepoke</w:t>
+              <w:t>Bhilaowal Kakeji</w:t>
             </w:r>
           </w:p>
         </w:tc>
@@ -10131,7 +10131,7 @@
               <w:rPr>
                 <w:sz w:val="16"/>
               </w:rPr>
-              <w:t>Lepoke</w:t>
+              <w:t>Bhagupur Utarh</w:t>
             </w:r>
           </w:p>
         </w:tc>
@@ -10285,7 +10285,7 @@
               <w:rPr>
                 <w:sz w:val="16"/>
               </w:rPr>
-              <w:t>Preet Nagar R.B.No. 167 + Overseas Elector</w:t>
+              <w:t>Bhillowal Pakka</w:t>
             </w:r>
           </w:p>
         </w:tc>
@@ -10439,7 +10439,7 @@
               <w:rPr>
                 <w:sz w:val="16"/>
               </w:rPr>
-              <w:t>Vairoke</w:t>
+              <w:t>Mudh</w:t>
             </w:r>
           </w:p>
         </w:tc>
@@ -10593,7 +10593,7 @@
               <w:rPr>
                 <w:sz w:val="16"/>
               </w:rPr>
-              <w:t>Bhilewal Kakeji</w:t>
+              <w:t>Chuchakwal</w:t>
             </w:r>
           </w:p>
         </w:tc>
@@ -10747,7 +10747,7 @@
               <w:rPr>
                 <w:sz w:val="16"/>
               </w:rPr>
-              <w:t>Bhaggupur Utar + Chhanna</w:t>
+              <w:t>Awan Lakha Singh</w:t>
             </w:r>
           </w:p>
         </w:tc>
@@ -10901,7 +10901,7 @@
               <w:rPr>
                 <w:sz w:val="16"/>
               </w:rPr>
-              <w:t>Bhilewal Pakka</w:t>
+              <w:t>Waryah</w:t>
             </w:r>
           </w:p>
         </w:tc>
@@ -11055,7 +11055,7 @@
               <w:rPr>
                 <w:sz w:val="16"/>
               </w:rPr>
-              <w:t>Muddh</w:t>
+              <w:t>Khusupura</w:t>
             </w:r>
           </w:p>
         </w:tc>
@@ -11209,7 +11209,7 @@
               <w:rPr>
                 <w:sz w:val="16"/>
               </w:rPr>
-              <w:t>Chuchakwal + Mujaffarpura</w:t>
+              <w:t>Tareen</w:t>
             </w:r>
           </w:p>
         </w:tc>
@@ -11363,7 +11363,7 @@
               <w:rPr>
                 <w:sz w:val="16"/>
               </w:rPr>
-              <w:t>Awan Lakha Singh</w:t>
+              <w:t>Saurhiyan</w:t>
             </w:r>
           </w:p>
         </w:tc>
@@ -11517,7 +11517,7 @@
               <w:rPr>
                 <w:sz w:val="16"/>
               </w:rPr>
-              <w:t>Wariah</w:t>
+              <w:t>Tallah</w:t>
             </w:r>
           </w:p>
         </w:tc>
@@ -11671,7 +11671,7 @@
               <w:rPr>
                 <w:sz w:val="16"/>
               </w:rPr>
-              <w:t>Khushpura + Hasanpura</w:t>
+              <w:t>Kot Sidhu</w:t>
             </w:r>
           </w:p>
         </w:tc>
@@ -11825,7 +11825,7 @@
               <w:rPr>
                 <w:sz w:val="16"/>
               </w:rPr>
-              <w:t>Tareen + Kakar</w:t>
+              <w:t>Karyal</w:t>
             </w:r>
           </w:p>
         </w:tc>
@@ -11979,7 +11979,7 @@
               <w:rPr>
                 <w:sz w:val="16"/>
               </w:rPr>
-              <w:t>Sarrian</w:t>
+              <w:t>Karyal</w:t>
             </w:r>
           </w:p>
         </w:tc>
@@ -12133,7 +12133,7 @@
               <w:rPr>
                 <w:sz w:val="16"/>
               </w:rPr>
-              <w:t>Talla</w:t>
+              <w:t>Miadi Kalan</w:t>
             </w:r>
           </w:p>
         </w:tc>
@@ -12287,7 +12287,7 @@
               <w:rPr>
                 <w:sz w:val="16"/>
               </w:rPr>
-              <w:t>Kot Singh</w:t>
+              <w:t>Jastarwal</w:t>
             </w:r>
           </w:p>
         </w:tc>
@@ -12441,7 +12441,7 @@
               <w:rPr>
                 <w:sz w:val="16"/>
               </w:rPr>
-              <w:t>Karial</w:t>
+              <w:t>Chhina Karam Singh</w:t>
             </w:r>
           </w:p>
         </w:tc>
@@ -12595,7 +12595,7 @@
               <w:rPr>
                 <w:sz w:val="16"/>
               </w:rPr>
-              <w:t>Karial</w:t>
+              <w:t>Nepal</w:t>
             </w:r>
           </w:p>
         </w:tc>
@@ -12749,7 +12749,7 @@
               <w:rPr>
                 <w:sz w:val="16"/>
               </w:rPr>
-              <w:t>Miadi Kalan + Kotli Muglan</w:t>
+              <w:t>Kotli Korotana</w:t>
             </w:r>
           </w:p>
         </w:tc>
@@ -12903,7 +12903,7 @@
               <w:rPr>
                 <w:sz w:val="16"/>
               </w:rPr>
-              <w:t>Jastarwal</w:t>
+              <w:t>Bohlian</w:t>
             </w:r>
           </w:p>
         </w:tc>
@@ -13057,7 +13057,7 @@
               <w:rPr>
                 <w:sz w:val="16"/>
               </w:rPr>
-              <w:t>Jastarwal</w:t>
+              <w:t>Bohlian</w:t>
             </w:r>
           </w:p>
         </w:tc>
@@ -13211,7 +13211,7 @@
               <w:rPr>
                 <w:sz w:val="16"/>
               </w:rPr>
-              <w:t>Chhina Karam Singh</w:t>
+              <w:t>Isapur</w:t>
             </w:r>
           </w:p>
         </w:tc>
@@ -13365,7 +13365,7 @@
               <w:rPr>
                 <w:sz w:val="16"/>
               </w:rPr>
-              <w:t>Nepal</w:t>
+              <w:t>Raipur Khurd</w:t>
             </w:r>
           </w:p>
         </w:tc>
@@ -13519,7 +13519,7 @@
               <w:rPr>
                 <w:sz w:val="16"/>
               </w:rPr>
-              <w:t>Kotli Koretana</w:t>
+              <w:t>Matiya</w:t>
             </w:r>
           </w:p>
         </w:tc>
@@ -13673,7 +13673,7 @@
               <w:rPr>
                 <w:sz w:val="16"/>
               </w:rPr>
-              <w:t>Bohlian</w:t>
+              <w:t>Mohar</w:t>
             </w:r>
           </w:p>
         </w:tc>
@@ -13827,7 +13827,7 @@
               <w:rPr>
                 <w:sz w:val="16"/>
               </w:rPr>
-              <w:t>Bohlian</w:t>
+              <w:t>Umarpura</w:t>
             </w:r>
           </w:p>
         </w:tc>
@@ -13981,7 +13981,7 @@
               <w:rPr>
                 <w:sz w:val="16"/>
               </w:rPr>
-              <w:t>Isapur</w:t>
+              <w:t>Umarpura</w:t>
             </w:r>
           </w:p>
         </w:tc>
@@ -14135,7 +14135,7 @@
               <w:rPr>
                 <w:sz w:val="16"/>
               </w:rPr>
-              <w:t>Raipur Khurd</w:t>
+              <w:t>Jauns</w:t>
             </w:r>
           </w:p>
         </w:tc>
@@ -14289,7 +14289,7 @@
               <w:rPr>
                 <w:sz w:val="16"/>
               </w:rPr>
-              <w:t>Matia</w:t>
+              <w:t>Othian</w:t>
             </w:r>
           </w:p>
         </w:tc>
@@ -14443,7 +14443,7 @@
               <w:rPr>
                 <w:sz w:val="16"/>
               </w:rPr>
-              <w:t>Mehar</w:t>
+              <w:t>Othian</w:t>
             </w:r>
           </w:p>
         </w:tc>
@@ -14597,7 +14597,7 @@
               <w:rPr>
                 <w:sz w:val="16"/>
               </w:rPr>
-              <w:t>Umarpura</w:t>
+              <w:t>Othian</w:t>
             </w:r>
           </w:p>
         </w:tc>
@@ -14751,7 +14751,7 @@
               <w:rPr>
                 <w:sz w:val="16"/>
               </w:rPr>
-              <w:t>Umarpura + Chahian</w:t>
+              <w:t>Dharamkot</w:t>
             </w:r>
           </w:p>
         </w:tc>
@@ -14905,7 +14905,7 @@
               <w:rPr>
                 <w:sz w:val="16"/>
               </w:rPr>
-              <w:t>Jass</w:t>
+              <w:t>Chakk Kamal Khan</w:t>
             </w:r>
           </w:p>
         </w:tc>
@@ -15059,7 +15059,7 @@
               <w:rPr>
                 <w:sz w:val="16"/>
               </w:rPr>
-              <w:t>Jass</w:t>
+              <w:t>Kotli Sakka</w:t>
             </w:r>
           </w:p>
         </w:tc>
@@ -15213,7 +15213,7 @@
               <w:rPr>
                 <w:sz w:val="16"/>
               </w:rPr>
-              <w:t>Othian</w:t>
+              <w:t>Mehmadpura</w:t>
             </w:r>
           </w:p>
         </w:tc>
@@ -15367,7 +15367,7 @@
               <w:rPr>
                 <w:sz w:val="16"/>
               </w:rPr>
-              <w:t>Othian + Rakh Othian</w:t>
+              <w:t>Jajje</w:t>
             </w:r>
           </w:p>
         </w:tc>
@@ -15521,7 +15521,7 @@
               <w:rPr>
                 <w:sz w:val="16"/>
               </w:rPr>
-              <w:t>Othian</w:t>
+              <w:t>Chakk Mishri Khan</w:t>
             </w:r>
           </w:p>
         </w:tc>
@@ -15675,7 +15675,7 @@
               <w:rPr>
                 <w:sz w:val="16"/>
               </w:rPr>
-              <w:t>Dharmkot</w:t>
+              <w:t>Chakk Mishri Khan</w:t>
             </w:r>
           </w:p>
         </w:tc>
@@ -15829,7 +15829,7 @@
               <w:rPr>
                 <w:sz w:val="16"/>
               </w:rPr>
-              <w:t>Chak Kamal Khan</w:t>
+              <w:t>Maure</w:t>
             </w:r>
           </w:p>
         </w:tc>
@@ -15983,7 +15983,7 @@
               <w:rPr>
                 <w:sz w:val="16"/>
               </w:rPr>
-              <w:t>Kotli Sakka</w:t>
+              <w:t>Maure</w:t>
             </w:r>
           </w:p>
         </w:tc>
@@ -16137,7 +16137,7 @@
               <w:rPr>
                 <w:sz w:val="16"/>
               </w:rPr>
-              <w:t>Mahmadpura + Kamirpura</w:t>
+              <w:t>Manawala</w:t>
             </w:r>
           </w:p>
         </w:tc>
@@ -16291,7 +16291,7 @@
               <w:rPr>
                 <w:sz w:val="16"/>
               </w:rPr>
-              <w:t>Jajje + Malakiri</w:t>
+              <w:t>Manawala</w:t>
             </w:r>
           </w:p>
         </w:tc>
@@ -16445,7 +16445,7 @@
               <w:rPr>
                 <w:sz w:val="16"/>
               </w:rPr>
-              <w:t>Chak Misri Khan</w:t>
+              <w:t>Chogawan</w:t>
             </w:r>
           </w:p>
         </w:tc>
@@ -16599,7 +16599,7 @@
               <w:rPr>
                 <w:sz w:val="16"/>
               </w:rPr>
-              <w:t>Chak Misri Khan</w:t>
+              <w:t>Chogawan</w:t>
             </w:r>
           </w:p>
         </w:tc>
@@ -16753,7 +16753,7 @@
               <w:rPr>
                 <w:sz w:val="16"/>
               </w:rPr>
-              <w:t>More</w:t>
+              <w:t>Chogawan</w:t>
             </w:r>
           </w:p>
         </w:tc>
@@ -16907,7 +16907,7 @@
               <w:rPr>
                 <w:sz w:val="16"/>
               </w:rPr>
-              <w:t>More</w:t>
+              <w:t>Chogawan</w:t>
             </w:r>
           </w:p>
         </w:tc>
@@ -17061,7 +17061,7 @@
               <w:rPr>
                 <w:sz w:val="16"/>
               </w:rPr>
-              <w:t>Manawala</w:t>
+              <w:t>Chogawan</w:t>
             </w:r>
           </w:p>
         </w:tc>
@@ -17215,7 +17215,7 @@
               <w:rPr>
                 <w:sz w:val="16"/>
               </w:rPr>
-              <w:t>Manawala</w:t>
+              <w:t>Chogawan</w:t>
             </w:r>
           </w:p>
         </w:tc>
@@ -17369,7 +17369,7 @@
               <w:rPr>
                 <w:sz w:val="16"/>
               </w:rPr>
-              <w:t>Chogawan</w:t>
+              <w:t>Bhullar</w:t>
             </w:r>
           </w:p>
         </w:tc>
@@ -17523,7 +17523,7 @@
               <w:rPr>
                 <w:sz w:val="16"/>
               </w:rPr>
-              <w:t>Chogawan</w:t>
+              <w:t>Bhullar</w:t>
             </w:r>
           </w:p>
         </w:tc>
@@ -17677,7 +17677,7 @@
               <w:rPr>
                 <w:sz w:val="16"/>
               </w:rPr>
-              <w:t>Chogawan</w:t>
+              <w:t>Bhullar</w:t>
             </w:r>
           </w:p>
         </w:tc>
@@ -17831,7 +17831,7 @@
               <w:rPr>
                 <w:sz w:val="16"/>
               </w:rPr>
-              <w:t>Chogawan</w:t>
+              <w:t>Tapiala</w:t>
             </w:r>
           </w:p>
         </w:tc>
@@ -17985,7 +17985,7 @@
               <w:rPr>
                 <w:sz w:val="16"/>
               </w:rPr>
-              <w:t>Chogawan</w:t>
+              <w:t>Tapiala</w:t>
             </w:r>
           </w:p>
         </w:tc>
@@ -18139,7 +18139,7 @@
               <w:rPr>
                 <w:sz w:val="16"/>
               </w:rPr>
-              <w:t>Chogawan</w:t>
+              <w:t>Thathi</w:t>
             </w:r>
           </w:p>
         </w:tc>
@@ -18293,7 +18293,7 @@
               <w:rPr>
                 <w:sz w:val="16"/>
               </w:rPr>
-              <w:t>Bhullar</w:t>
+              <w:t>Thatha</w:t>
             </w:r>
           </w:p>
         </w:tc>
@@ -18447,7 +18447,7 @@
               <w:rPr>
                 <w:sz w:val="16"/>
               </w:rPr>
-              <w:t>Bhullar</w:t>
+              <w:t>Bhangwan</w:t>
             </w:r>
           </w:p>
         </w:tc>
@@ -18601,7 +18601,7 @@
               <w:rPr>
                 <w:sz w:val="16"/>
               </w:rPr>
-              <w:t>Bhullar</w:t>
+              <w:t>Odar</w:t>
             </w:r>
           </w:p>
         </w:tc>
@@ -18755,7 +18755,7 @@
               <w:rPr>
                 <w:sz w:val="16"/>
               </w:rPr>
-              <w:t>Tapiala</w:t>
+              <w:t>Joeke</w:t>
             </w:r>
           </w:p>
         </w:tc>
@@ -18909,7 +18909,7 @@
               <w:rPr>
                 <w:sz w:val="16"/>
               </w:rPr>
-              <w:t>Tapiala</w:t>
+              <w:t>Kamaska</w:t>
             </w:r>
           </w:p>
         </w:tc>
@@ -19063,7 +19063,7 @@
               <w:rPr>
                 <w:sz w:val="16"/>
               </w:rPr>
-              <w:t>Thathi</w:t>
+              <w:t>Bachiwind</w:t>
             </w:r>
           </w:p>
         </w:tc>
@@ -19217,7 +19217,7 @@
               <w:rPr>
                 <w:sz w:val="16"/>
               </w:rPr>
-              <w:t>Thattha</w:t>
+              <w:t>Bachiwind</w:t>
             </w:r>
           </w:p>
         </w:tc>
@@ -19371,7 +19371,7 @@
               <w:rPr>
                 <w:sz w:val="16"/>
               </w:rPr>
-              <w:t>Bhangwan + Sidhwan + Theekriwala</w:t>
+              <w:t>Bachiwind</w:t>
             </w:r>
           </w:p>
         </w:tc>
@@ -19525,7 +19525,7 @@
               <w:rPr>
                 <w:sz w:val="16"/>
               </w:rPr>
-              <w:t>Udar</w:t>
+              <w:t>Dala</w:t>
             </w:r>
           </w:p>
         </w:tc>
@@ -19679,7 +19679,7 @@
               <w:rPr>
                 <w:sz w:val="16"/>
               </w:rPr>
-              <w:t>Joeke</w:t>
+              <w:t>Kiralgarh</w:t>
             </w:r>
           </w:p>
         </w:tc>
@@ -19833,7 +19833,7 @@
               <w:rPr>
                 <w:sz w:val="16"/>
               </w:rPr>
-              <w:t>Kamaske + Khijarpura</w:t>
+              <w:t>Shahura</w:t>
             </w:r>
           </w:p>
         </w:tc>
@@ -19987,7 +19987,7 @@
               <w:rPr>
                 <w:sz w:val="16"/>
               </w:rPr>
-              <w:t>Bachhiwind</w:t>
+              <w:t>Shahura</w:t>
             </w:r>
           </w:p>
         </w:tc>
@@ -20141,7 +20141,7 @@
               <w:rPr>
                 <w:sz w:val="16"/>
               </w:rPr>
-              <w:t>Bachhiwind</w:t>
+              <w:t>Shahura</w:t>
             </w:r>
           </w:p>
         </w:tc>
@@ -20295,7 +20295,7 @@
               <w:rPr>
                 <w:sz w:val="16"/>
               </w:rPr>
-              <w:t>Bachhiwind</w:t>
+              <w:t>Dalleki</w:t>
             </w:r>
           </w:p>
         </w:tc>
@@ -20449,7 +20449,7 @@
               <w:rPr>
                 <w:sz w:val="16"/>
               </w:rPr>
-              <w:t>Dala</w:t>
+              <w:t>Beharwal</w:t>
             </w:r>
           </w:p>
         </w:tc>
@@ -20603,7 +20603,7 @@
               <w:rPr>
                 <w:sz w:val="16"/>
               </w:rPr>
-              <w:t>Kirlgarh</w:t>
+              <w:t>Vaineke</w:t>
             </w:r>
           </w:p>
         </w:tc>
@@ -20757,7 +20757,7 @@
               <w:rPr>
                 <w:sz w:val="16"/>
               </w:rPr>
-              <w:t>Shahura</w:t>
+              <w:t>Vaineke</w:t>
             </w:r>
           </w:p>
         </w:tc>
@@ -20911,7 +20911,7 @@
               <w:rPr>
                 <w:sz w:val="16"/>
               </w:rPr>
-              <w:t>Shahura</w:t>
+              <w:t>Cheleki</w:t>
             </w:r>
           </w:p>
         </w:tc>
@@ -21065,7 +21065,7 @@
               <w:rPr>
                 <w:sz w:val="16"/>
               </w:rPr>
-              <w:t>Shahura</w:t>
+              <w:t>Kohala</w:t>
             </w:r>
           </w:p>
         </w:tc>
@@ -21219,7 +21219,7 @@
               <w:rPr>
                 <w:sz w:val="16"/>
               </w:rPr>
-              <w:t>Dalleki</w:t>
+              <w:t>Kohala</w:t>
             </w:r>
           </w:p>
         </w:tc>
@@ -21373,7 +21373,7 @@
               <w:rPr>
                 <w:sz w:val="16"/>
               </w:rPr>
-              <w:t>Bahirwal</w:t>
+              <w:t>Chawinda Kalan</w:t>
             </w:r>
           </w:p>
         </w:tc>
@@ -21527,7 +21527,7 @@
               <w:rPr>
                 <w:sz w:val="16"/>
               </w:rPr>
-              <w:t>Wanieke</w:t>
+              <w:t>Chawinda Kalan</w:t>
             </w:r>
           </w:p>
         </w:tc>
@@ -21681,7 +21681,7 @@
               <w:rPr>
                 <w:sz w:val="16"/>
               </w:rPr>
-              <w:t>Wanieke</w:t>
+              <w:t>Chawinda Khurd</w:t>
             </w:r>
           </w:p>
         </w:tc>
@@ -21835,7 +21835,7 @@
               <w:rPr>
                 <w:sz w:val="16"/>
               </w:rPr>
-              <w:t>Cheleki + Kotli Allakh</w:t>
+              <w:t>Padhari</w:t>
             </w:r>
           </w:p>
         </w:tc>
@@ -21989,7 +21989,7 @@
               <w:rPr>
                 <w:sz w:val="16"/>
               </w:rPr>
-              <w:t>Kohala (Sajja Pasa)</w:t>
+              <w:t>Padhari</w:t>
             </w:r>
           </w:p>
         </w:tc>
@@ -22143,7 +22143,7 @@
               <w:rPr>
                 <w:sz w:val="16"/>
               </w:rPr>
-              <w:t>Kohala (Khabba Pasa)</w:t>
+              <w:t>Lanven</w:t>
             </w:r>
           </w:p>
         </w:tc>
@@ -22297,7 +22297,7 @@
               <w:rPr>
                 <w:sz w:val="16"/>
               </w:rPr>
-              <w:t>Chawinda Kalan</w:t>
+              <w:t>Nurpur</w:t>
             </w:r>
           </w:p>
         </w:tc>
@@ -22451,7 +22451,7 @@
               <w:rPr>
                 <w:sz w:val="16"/>
               </w:rPr>
-              <w:t>Chawinda Kalan</w:t>
+              <w:t>Chhidan</w:t>
             </w:r>
           </w:p>
         </w:tc>
@@ -22605,7 +22605,7 @@
               <w:rPr>
                 <w:sz w:val="16"/>
               </w:rPr>
-              <w:t>Chawinda Khurd</w:t>
+              <w:t>Chhidan</w:t>
             </w:r>
           </w:p>
         </w:tc>
@@ -22759,7 +22759,7 @@
               <w:rPr>
                 <w:sz w:val="16"/>
               </w:rPr>
-              <w:t>Paddhari</w:t>
+              <w:t>Bopa Rai Kalan</w:t>
             </w:r>
           </w:p>
         </w:tc>
@@ -22913,7 +22913,7 @@
               <w:rPr>
                 <w:sz w:val="16"/>
               </w:rPr>
-              <w:t>Paddhari</w:t>
+              <w:t>Bopa Rai Kalan</w:t>
             </w:r>
           </w:p>
         </w:tc>
@@ -23067,7 +23067,7 @@
               <w:rPr>
                 <w:sz w:val="16"/>
               </w:rPr>
-              <w:t>Lande</w:t>
+              <w:t>Bopa Rai Khurd</w:t>
             </w:r>
           </w:p>
         </w:tc>
@@ -23221,7 +23221,7 @@
               <w:rPr>
                 <w:sz w:val="16"/>
               </w:rPr>
-              <w:t>Nurpur</w:t>
+              <w:t>Bopa Rai Khurd</w:t>
             </w:r>
           </w:p>
         </w:tc>
@@ -23375,7 +23375,7 @@
               <w:rPr>
                 <w:sz w:val="16"/>
               </w:rPr>
-              <w:t>Chhiddan</w:t>
+              <w:t>Kolowal</w:t>
             </w:r>
           </w:p>
         </w:tc>
@@ -23529,7 +23529,7 @@
               <w:rPr>
                 <w:sz w:val="16"/>
               </w:rPr>
-              <w:t>Chhiddan</w:t>
+              <w:t>Brar</w:t>
             </w:r>
           </w:p>
         </w:tc>
@@ -23682,7 +23682,7 @@
               <w:rPr>
                 <w:sz w:val="16"/>
               </w:rPr>
-              <w:t>Boparai Kalan</w:t>
+              <w:t>Brar</w:t>
             </w:r>
           </w:p>
         </w:tc>
@@ -23836,7 +23836,7 @@
               <w:rPr>
                 <w:sz w:val="16"/>
               </w:rPr>
-              <w:t>Boparai Kalan</w:t>
+              <w:t>Madhoke</w:t>
             </w:r>
           </w:p>
         </w:tc>
@@ -23990,7 +23990,7 @@
               <w:rPr>
                 <w:sz w:val="16"/>
               </w:rPr>
-              <w:t>Boparai Khurd</w:t>
+              <w:t>Khiala Kalan</w:t>
             </w:r>
           </w:p>
         </w:tc>
@@ -24144,7 +24144,7 @@
               <w:rPr>
                 <w:sz w:val="16"/>
               </w:rPr>
-              <w:t>Boparai Khurd</w:t>
+              <w:t>Khiala Kalan</w:t>
             </w:r>
           </w:p>
         </w:tc>
@@ -24298,7 +24298,7 @@
               <w:rPr>
                 <w:sz w:val="16"/>
               </w:rPr>
-              <w:t>Kolewal</w:t>
+              <w:t>Khiala Kalan</w:t>
             </w:r>
           </w:p>
         </w:tc>
@@ -24452,7 +24452,7 @@
               <w:rPr>
                 <w:sz w:val="16"/>
               </w:rPr>
-              <w:t>Brar</w:t>
+              <w:t>Bopa Rai Baj Singh</w:t>
             </w:r>
           </w:p>
         </w:tc>
@@ -24606,7 +24606,7 @@
               <w:rPr>
                 <w:sz w:val="16"/>
               </w:rPr>
-              <w:t>Brar</w:t>
+              <w:t>Bopa Rai Baj Singh</w:t>
             </w:r>
           </w:p>
         </w:tc>
@@ -24760,7 +24760,7 @@
               <w:rPr>
                 <w:sz w:val="16"/>
               </w:rPr>
-              <w:t>Madeke</w:t>
+              <w:t>Kaler</w:t>
             </w:r>
           </w:p>
         </w:tc>
@@ -24914,7 +24914,7 @@
               <w:rPr>
                 <w:sz w:val="16"/>
               </w:rPr>
-              <w:t>Khiala Kalan</w:t>
+              <w:t>Kaler</w:t>
             </w:r>
           </w:p>
         </w:tc>
@@ -25068,7 +25068,7 @@
               <w:rPr>
                 <w:sz w:val="16"/>
               </w:rPr>
-              <w:t>Khiala Kalan</w:t>
+              <w:t>Baba Mike Shah Colony</w:t>
             </w:r>
           </w:p>
         </w:tc>
@@ -25376,7 +25376,7 @@
               <w:rPr>
                 <w:sz w:val="16"/>
               </w:rPr>
-              <w:t>Bopa Rai Baj Singh</w:t>
+              <w:t>Kohali</w:t>
             </w:r>
           </w:p>
         </w:tc>
@@ -25530,7 +25530,7 @@
               <w:rPr>
                 <w:sz w:val="16"/>
               </w:rPr>
-              <w:t>Bopa Rai Baj Singh</w:t>
+              <w:t>Kohali</w:t>
             </w:r>
           </w:p>
         </w:tc>
@@ -25684,7 +25684,7 @@
               <w:rPr>
                 <w:sz w:val="16"/>
               </w:rPr>
-              <w:t>Kaler</w:t>
+              <w:t>Kohali</w:t>
             </w:r>
           </w:p>
         </w:tc>
@@ -25838,7 +25838,7 @@
               <w:rPr>
                 <w:sz w:val="16"/>
               </w:rPr>
-              <w:t>Kaler</w:t>
+              <w:t>Kohali</w:t>
             </w:r>
           </w:p>
         </w:tc>
@@ -25992,7 +25992,7 @@
               <w:rPr>
                 <w:sz w:val="16"/>
               </w:rPr>
-              <w:t>Baba Meeke Shah Colony</w:t>
+              <w:t>Bhittewad</w:t>
             </w:r>
           </w:p>
         </w:tc>
@@ -26146,7 +26146,7 @@
               <w:rPr>
                 <w:sz w:val="16"/>
               </w:rPr>
-              <w:t>Khiala Khurd</w:t>
+              <w:t>Bhittewad</w:t>
             </w:r>
           </w:p>
         </w:tc>
@@ -26300,7 +26300,7 @@
               <w:rPr>
                 <w:sz w:val="16"/>
               </w:rPr>
-              <w:t>Kohali</w:t>
+              <w:t>Bhittewad</w:t>
             </w:r>
           </w:p>
         </w:tc>
@@ -26454,7 +26454,7 @@
               <w:rPr>
                 <w:sz w:val="16"/>
               </w:rPr>
-              <w:t>Kohali</w:t>
+              <w:t>Bagga Khurd</w:t>
             </w:r>
           </w:p>
         </w:tc>
@@ -26608,7 +26608,7 @@
               <w:rPr>
                 <w:sz w:val="16"/>
               </w:rPr>
-              <w:t>Kohali</w:t>
+              <w:t>Bagga Kalan</w:t>
             </w:r>
           </w:p>
         </w:tc>
@@ -26762,7 +26762,7 @@
               <w:rPr>
                 <w:sz w:val="16"/>
               </w:rPr>
-              <w:t>Kohali + Rakh Kohali</w:t>
+              <w:t>Bagga Kalan</w:t>
             </w:r>
           </w:p>
         </w:tc>
@@ -26916,7 +26916,7 @@
               <w:rPr>
                 <w:sz w:val="16"/>
               </w:rPr>
-              <w:t>Bhittewad</w:t>
+              <w:t>Dhariwal</w:t>
             </w:r>
           </w:p>
         </w:tc>
@@ -27070,7 +27070,7 @@
               <w:rPr>
                 <w:sz w:val="16"/>
               </w:rPr>
-              <w:t>Bhittewad</w:t>
+              <w:t>Lalla Afgana</w:t>
             </w:r>
           </w:p>
         </w:tc>
@@ -27224,7 +27224,7 @@
               <w:rPr>
                 <w:sz w:val="16"/>
               </w:rPr>
-              <w:t>Bhittewad</w:t>
+              <w:t>Harsha Chhina (Abadi Ucha Qila)</w:t>
             </w:r>
           </w:p>
         </w:tc>
@@ -27378,7 +27378,7 @@
               <w:rPr>
                 <w:sz w:val="16"/>
               </w:rPr>
-              <w:t>Bagga Khurd + Overseas Elector</w:t>
+              <w:t>Harsha Chhina (Abadi Ucha Qila)</w:t>
             </w:r>
           </w:p>
         </w:tc>
@@ -27532,7 +27532,7 @@
               <w:rPr>
                 <w:sz w:val="16"/>
               </w:rPr>
-              <w:t>Bagga Kalan</w:t>
+              <w:t>Harsha Chhina (Abadi Vichla Qila)</w:t>
             </w:r>
           </w:p>
         </w:tc>
@@ -27686,7 +27686,7 @@
               <w:rPr>
                 <w:sz w:val="16"/>
               </w:rPr>
-              <w:t>Bagga Kalan</w:t>
+              <w:t>Harsha Chhina (Abadi Vichla Qila)</w:t>
             </w:r>
           </w:p>
         </w:tc>
@@ -27840,7 +27840,7 @@
               <w:rPr>
                 <w:sz w:val="16"/>
               </w:rPr>
-              <w:t>Dhariwal</w:t>
+              <w:t>Harsha Chhina (Abadi Vichla Qila)</w:t>
             </w:r>
           </w:p>
         </w:tc>
@@ -27994,7 +27994,7 @@
               <w:rPr>
                 <w:sz w:val="16"/>
               </w:rPr>
-              <w:t>Lalla Afgana</w:t>
+              <w:t>Harsha Chhina (Abadi Kukkranwala)</w:t>
             </w:r>
           </w:p>
         </w:tc>
@@ -28148,7 +28148,7 @@
               <w:rPr>
                 <w:sz w:val="16"/>
               </w:rPr>
-              <w:t>Harsha Chhina (Abadi Ucha Kila)</w:t>
+              <w:t>Harsha Chhina (Abadi Sabajpur)</w:t>
             </w:r>
           </w:p>
         </w:tc>
@@ -28302,7 +28302,7 @@
               <w:rPr>
                 <w:sz w:val="16"/>
               </w:rPr>
-              <w:t>Harsha Chhina (Abadi Ucha Kila)</w:t>
+              <w:t>Harsha Chhina (Abadi Sabajpur)</w:t>
             </w:r>
           </w:p>
         </w:tc>
@@ -28456,7 +28456,7 @@
               <w:rPr>
                 <w:sz w:val="16"/>
               </w:rPr>
-              <w:t>Harsha Chhina (Abadi Vichla Kila)</w:t>
+              <w:t>Nangal Tola</w:t>
             </w:r>
           </w:p>
         </w:tc>
@@ -28610,7 +28610,7 @@
               <w:rPr>
                 <w:sz w:val="16"/>
               </w:rPr>
-              <w:t>Harsha Chhina (Abadi Vichla Kila)</w:t>
+              <w:t>Nangal Tola</w:t>
             </w:r>
           </w:p>
         </w:tc>
@@ -28764,7 +28764,7 @@
               <w:rPr>
                 <w:sz w:val="16"/>
               </w:rPr>
-              <w:t>Harsha Chhina (Abadi Vichla Kila)</w:t>
+              <w:t>Jhanjoti</w:t>
             </w:r>
           </w:p>
         </w:tc>
@@ -28918,7 +28918,7 @@
               <w:rPr>
                 <w:sz w:val="16"/>
               </w:rPr>
-              <w:t>Harsha Chhina (Kukranwala)</w:t>
+              <w:t>Jhanjoti</w:t>
             </w:r>
           </w:p>
         </w:tc>
@@ -29072,7 +29072,7 @@
               <w:rPr>
                 <w:sz w:val="16"/>
               </w:rPr>
-              <w:t>Harsha Chhina (Abadi Sabajpur)</w:t>
+              <w:t>Jhanjoti</w:t>
             </w:r>
           </w:p>
         </w:tc>
@@ -29226,7 +29226,7 @@
               <w:rPr>
                 <w:sz w:val="16"/>
               </w:rPr>
-              <w:t>Harsha Chhina (Abadi Sabajpur)</w:t>
+              <w:t>Chainpur</w:t>
             </w:r>
           </w:p>
         </w:tc>
@@ -29380,7 +29380,7 @@
               <w:rPr>
                 <w:sz w:val="16"/>
               </w:rPr>
-              <w:t>Nangal Tola</w:t>
+              <w:t>Balagan</w:t>
             </w:r>
           </w:p>
         </w:tc>
@@ -29534,7 +29534,7 @@
               <w:rPr>
                 <w:sz w:val="16"/>
               </w:rPr>
-              <w:t>Nangal Tola</w:t>
+              <w:t>Balagan Sidhu</w:t>
             </w:r>
           </w:p>
         </w:tc>
@@ -29688,7 +29688,7 @@
               <w:rPr>
                 <w:sz w:val="16"/>
               </w:rPr>
-              <w:t>Jhojeti</w:t>
+              <w:t>Kotla Doom</w:t>
             </w:r>
           </w:p>
         </w:tc>
@@ -29842,7 +29842,7 @@
               <w:rPr>
                 <w:sz w:val="16"/>
               </w:rPr>
-              <w:t>Jhanjoti</w:t>
+              <w:t>Kotla Doom</w:t>
             </w:r>
           </w:p>
         </w:tc>
@@ -29996,7 +29996,7 @@
               <w:rPr>
                 <w:sz w:val="16"/>
               </w:rPr>
-              <w:t>Jhanjoti</w:t>
+              <w:t>Saidpur</w:t>
             </w:r>
           </w:p>
         </w:tc>
@@ -30150,7 +30150,7 @@
               <w:rPr>
                 <w:sz w:val="16"/>
               </w:rPr>
-              <w:t>Chainpur</w:t>
+              <w:t>Radala</w:t>
             </w:r>
           </w:p>
         </w:tc>
@@ -30304,7 +30304,7 @@
               <w:rPr>
                 <w:sz w:val="16"/>
               </w:rPr>
-              <w:t>Balaggan</w:t>
+              <w:t>Raja Sansi</w:t>
             </w:r>
           </w:p>
         </w:tc>
@@ -30458,7 +30458,7 @@
               <w:rPr>
                 <w:sz w:val="16"/>
               </w:rPr>
-              <w:t>Balaggan Sindhu</w:t>
+              <w:t>Raja Sansi</w:t>
             </w:r>
           </w:p>
         </w:tc>
@@ -30612,7 +30612,7 @@
               <w:rPr>
                 <w:sz w:val="16"/>
               </w:rPr>
-              <w:t>Kotla Doom</w:t>
+              <w:t>Raja Sansi</w:t>
             </w:r>
           </w:p>
         </w:tc>
@@ -30766,7 +30766,7 @@
               <w:rPr>
                 <w:sz w:val="16"/>
               </w:rPr>
-              <w:t>Kotla Doom</w:t>
+              <w:t>Raja Sansi</w:t>
             </w:r>
           </w:p>
         </w:tc>
@@ -30920,7 +30920,7 @@
               <w:rPr>
                 <w:sz w:val="16"/>
               </w:rPr>
-              <w:t>Saidpur</w:t>
+              <w:t>Raja Sansi</w:t>
             </w:r>
           </w:p>
         </w:tc>
@@ -31074,7 +31074,7 @@
               <w:rPr>
                 <w:sz w:val="16"/>
               </w:rPr>
-              <w:t>Radala</w:t>
+              <w:t>Raja Sansi</w:t>
             </w:r>
           </w:p>
         </w:tc>
@@ -31228,7 +31228,7 @@
               <w:rPr>
                 <w:sz w:val="16"/>
               </w:rPr>
-              <w:t>Ward No. 1 Muhalla Gandhi Nagar + Ward No. 1 Muhalla Gandhi Nagar + Ward No. 1 Muhalla Gandhi Nagar + Ward No. 1 Muhalla Gandhi Nagar</w:t>
+              <w:t>Raja Sansi</w:t>
             </w:r>
           </w:p>
         </w:tc>
@@ -31382,7 +31382,7 @@
               <w:rPr>
                 <w:sz w:val="16"/>
               </w:rPr>
-              <w:t>Ward No. 12 Rajasansi Muhalla Gandhi Nagar + Ward No. 12 Muhalla Gandhi Nagar</w:t>
+              <w:t>Raja Sansi</w:t>
             </w:r>
           </w:p>
         </w:tc>
@@ -31536,7 +31536,7 @@
               <w:rPr>
                 <w:sz w:val="16"/>
               </w:rPr>
-              <w:t>Ward No 2 Muhalla Gandhi Nagar Rajasansi + Ward No 2 Muhalla Gandhi Nagar Rajasansi</w:t>
+              <w:t>Raja Sansi</w:t>
             </w:r>
           </w:p>
         </w:tc>
@@ -31690,7 +31690,7 @@
               <w:rPr>
                 <w:sz w:val="16"/>
               </w:rPr>
-              <w:t>Ward No. 10 Gali Sambh Wali + Ward No. 10 Gali Ghah Mandi + Ward No. 10 Gali Zaildara Wali</w:t>
+              <w:t>Raja Sansi</w:t>
             </w:r>
           </w:p>
         </w:tc>
@@ -31844,7 +31844,7 @@
               <w:rPr>
                 <w:sz w:val="16"/>
               </w:rPr>
-              <w:t>Rajasansi Ward No. 3 Gali Doctor Amar Singh Wali + Ward No. 3 Adli Wala Road Khabba Pasa Rajasansi + Ward No. 3 Gali Purohita Wali + Ward No. 3 Wala Khooh Lelia Wala, Navi Colony</w:t>
+              <w:t>Raja Sansi</w:t>
             </w:r>
           </w:p>
         </w:tc>
@@ -31998,7 +31998,7 @@
               <w:rPr>
                 <w:sz w:val="16"/>
               </w:rPr>
-              <w:t>Ward No. 6 Muhalla Mandir Devi Dwar + Ward No. 6 Muhalla Gandhi Nagar + Ward No. 6 Colony Baba Jawand Singh Khooh Chuhar Singh Wala</w:t>
+              <w:t>Raja Sansi</w:t>
             </w:r>
           </w:p>
         </w:tc>
@@ -32152,7 +32152,7 @@
               <w:rPr>
                 <w:sz w:val="16"/>
               </w:rPr>
-              <w:t>Ward No: 7 Rajasansi Muhalla Sri Pritam Singh Gali Bajaja Wali Main Bazar + Ward No: 7 Main Bazar Sahamne Gurdwara Singh Sabha + Ward No: 7 Muhalla Sri Pritam Singh Gali Lehe Wali + Ward No: 7 Muhalla Pritam Singh Gali Lehe Wali + Ward No: 7 Gali Sahzada + Ward No: 7 Gali Lehe Wali + Overseas Elector</w:t>
+              <w:t>Raja Sansi</w:t>
             </w:r>
           </w:p>
         </w:tc>
@@ -32306,7 +32306,7 @@
               <w:rPr>
                 <w:sz w:val="16"/>
               </w:rPr>
-              <w:t>Ward No. 11 Gali Ghumiara Wali + Ward No. 11 Gali Zaildara Wali + Ward No. 11 Gali Gurdwara Kalgidhar + Ward No. 11 Main Bazar Gurdwara Kalgidhar + Ward No. 11 Main Bazar + Ward No. 11 Gali Wajira Wali + Ward No. 11 Main Bazar + Ward No. 11 Main Bazar</w:t>
+              <w:t>Raja Sansi</w:t>
             </w:r>
           </w:p>
         </w:tc>
@@ -32460,7 +32460,7 @@
               <w:rPr>
                 <w:sz w:val="16"/>
               </w:rPr>
-              <w:t>Ward No 4 Navi Colony Sahamne Airport Rajasansi + Ward No 4 Ajnala Road Airport Colony Rajasansi + Ward No 4 Ajnala Road Airport Colony Rajasansi</w:t>
+              <w:t>Ladeh</w:t>
             </w:r>
           </w:p>
         </w:tc>
@@ -32614,7 +32614,7 @@
               <w:rPr>
                 <w:sz w:val="16"/>
               </w:rPr>
-              <w:t>Ward No. 5 Colony Baba Jawand Singh Ajnala Road + Ward No. 5 Nawan Adda Rajasansi + Ward No. 5 Ajnala Road Nere Ajit Palace + Ward No. 5 Ajnala Road Khabba Pasa Khooh Chuhar Singh Wala + Ward No. 5 Ajnala Road Khabba Pasa Khooh Chuhar Singh Wala + Ward No. 5 Ajnala Road Khabba Pasa Khooh Chuhar Singh Wala + Ward No. 5 Ajnala Road Civil Colony Airport</w:t>
+              <w:t>Ranewali</w:t>
             </w:r>
           </w:p>
         </w:tc>
@@ -32768,7 +32768,7 @@
               <w:rPr>
                 <w:sz w:val="16"/>
               </w:rPr>
-              <w:t>Ward No 8 Muhalla Thakar Singh Gali Ghumiara Wali + Ward No 8 Muhalla Thakar Singh Gali Ghumiara Wali + Ward No 8 Muhalla Thakar Singh Gali Ghumiara Wali</w:t>
+              <w:t>Muglani Kot</w:t>
             </w:r>
           </w:p>
         </w:tc>
@@ -32922,7 +32922,7 @@
               <w:rPr>
                 <w:sz w:val="16"/>
               </w:rPr>
-              <w:t>Ward No. 9 Main Bazar Gali Lohara Wali + Ward No. 9 Gali Mistri Mehar Singh Wali + Ward No. 9 Gali Mistri Mehar Singh Wali + Ward No. 9 Sahamne Bagichi</w:t>
+              <w:t>Jagdev Kalan</w:t>
             </w:r>
           </w:p>
         </w:tc>
@@ -33076,7 +33076,7 @@
               <w:rPr>
                 <w:sz w:val="16"/>
               </w:rPr>
-              <w:t>Rajasansi Ward No. 9 Ghar Mandi Road + Ward No. 9 Gali Chhibia Wali + Ward No. 9 Ghar Mandi Rajasansi + Ward No. 9 Sahamne Bagichi + Ward No. 9 Gali Dhobia Wali</w:t>
+              <w:t>Jagdev Kalan</w:t>
             </w:r>
           </w:p>
         </w:tc>
@@ -33230,7 +33230,7 @@
               <w:rPr>
                 <w:sz w:val="16"/>
               </w:rPr>
-              <w:t>Ward No. 13 Gali Lohara Wali + Ward No. 13 Muhalla Masit Wala + Ward No. 13 Main Bazar Sahamne Muhalla Thakar Singh Wala + Ward No. 13 Main Bazar Sahamne Muhalla Thakar Singh Wala + Overseas Elector</w:t>
+              <w:t>Jagdev Kalan</w:t>
             </w:r>
           </w:p>
         </w:tc>
@@ -33384,7 +33384,7 @@
               <w:rPr>
                 <w:sz w:val="16"/>
               </w:rPr>
-              <w:t>Ladeh</w:t>
+              <w:t>Jagdev Kalan</w:t>
             </w:r>
           </w:p>
         </w:tc>
@@ -33538,7 +33538,7 @@
               <w:rPr>
                 <w:sz w:val="16"/>
               </w:rPr>
-              <w:t>Ranewali</w:t>
+              <w:t>Mallu Nangal</w:t>
             </w:r>
           </w:p>
         </w:tc>
@@ -33692,7 +33692,7 @@
               <w:rPr>
                 <w:sz w:val="16"/>
               </w:rPr>
-              <w:t>Muglani Kot</w:t>
+              <w:t>Mallu Nangal</w:t>
             </w:r>
           </w:p>
         </w:tc>
@@ -33846,7 +33846,7 @@
               <w:rPr>
                 <w:sz w:val="16"/>
               </w:rPr>
-              <w:t>Jagdev Kalan</w:t>
+              <w:t>Adli Wala</w:t>
             </w:r>
           </w:p>
         </w:tc>
@@ -34000,7 +34000,7 @@
               <w:rPr>
                 <w:sz w:val="16"/>
               </w:rPr>
-              <w:t>Jagdev Kalan</w:t>
+              <w:t>Adli Wala</w:t>
             </w:r>
           </w:p>
         </w:tc>
@@ -34154,7 +34154,7 @@
               <w:rPr>
                 <w:sz w:val="16"/>
               </w:rPr>
-              <w:t>Jagdev Kalan</w:t>
+              <w:t>Adli Wala</w:t>
             </w:r>
           </w:p>
         </w:tc>
@@ -34308,7 +34308,7 @@
               <w:rPr>
                 <w:sz w:val="16"/>
               </w:rPr>
-              <w:t>Jagdev Kalan</w:t>
+              <w:t>Bua Nangali</w:t>
             </w:r>
           </w:p>
         </w:tc>

</xml_diff>